<commit_message>
Lesson plan: AI video opener, move virtual lab into teach section
Co-Authored-By: Claude Opus 5.5 <noreply@anthropic.com>
Claude-Session: https://claude.ai/code/session_01EFvpNjZjd5cMm35XwaBc9n
</commit_message>
<xml_diff>
--- a/تحضير_الانخفاض_في_الضغط_البخاري.docx
+++ b/تحضير_الانخفاض_في_الضغط_البخاري.docx
@@ -1962,7 +1962,7 @@
           <w:rtl/>
           <w:lang w:bidi="ar-KW"/>
         </w:rPr>
-        <w:t xml:space="preserve">1- مناقشة الصورة الافتتاحية للدرس:</w:t>
+        <w:t xml:space="preserve">مقطع مرئي مُعدّ بالذكاء الاصطناعي:</w:t>
       </w:r>
     </w:p>
     <w:p>
@@ -1985,7 +1985,30 @@
           <w:rtl/>
           <w:lang w:bidi="ar-KW"/>
         </w:rPr>
-        <w:t xml:space="preserve">باستخدام استراتيجية المناقشة والعصف الذهني، أعرض على الطالبات الصورة الافتتاحية للدرس (شكل 45) لشاحنة مخصّصة لرشّ الملح على الطرقات لمنع تكوّن الجليد، وأطرح عليهن الأسئلة التالية:</w:t>
+        <w:t xml:space="preserve">باستخدام استراتيجية المناقشة والعصف الذهني، أعرض على الطالبات مقطعًا مرئيًا قصيرًا مُعدًّا بالذكاء الاصطناعي، يعرض مواقف من الحياة اليومية: شاحنة ترشّ الملح على الطرقات في المناطق الباردة لمنع تكوّن الجليد، وسائق يُضيف مادة مضادة للتجمّد (Anti-gel) إلى مبرّد السيارة، وإضافة الملح إلى ماء الطهي، ووعاءين مغلقين أحدهما يحتوي على ماء نقي والآخر على ماء مُذاب فيه سكر يتصاعد منهما البخار بمعدّلين مختلفين.</w:t>
+      </w:r>
+    </w:p>
+    <w:p>
+      <w:pPr>
+        <w:spacing w:after="0" w:line="360" w:lineRule="auto"/>
+        <w:jc w:val="both"/>
+        <w:rPr>
+          <w:rFonts w:asciiTheme="majorBidi" w:hAnsiTheme="majorBidi" w:cstheme="majorBidi"/>
+          <w:sz w:val="28"/>
+          <w:szCs w:val="28"/>
+          <w:rtl/>
+          <w:lang w:bidi="ar-KW"/>
+        </w:rPr>
+      </w:pPr>
+      <w:r>
+        <w:rPr>
+          <w:rFonts w:asciiTheme="majorBidi" w:hAnsiTheme="majorBidi" w:cstheme="majorBidi"/>
+          <w:sz w:val="28"/>
+          <w:szCs w:val="28"/>
+          <w:rtl/>
+          <w:lang w:bidi="ar-KW"/>
+        </w:rPr>
+        <w:t xml:space="preserve">بعد انتهاء المقطع أناقش الطالبات في ملاحظاتهن واستنتاجاتهن من خلال الأسئلة التالية:</w:t>
       </w:r>
     </w:p>
     <w:p>
@@ -2013,7 +2036,7 @@
           <w:rtl/>
           <w:lang w:bidi="ar-KW"/>
         </w:rPr>
-        <w:t xml:space="preserve">ماذا تلاحظين في الصورة؟ ولماذا تلجأ السلطات المحلية في المناطق الباردة إلى رشّ الملح الصلب على الطرقات؟</w:t>
+        <w:t xml:space="preserve">ماذا لاحظتِ في المقطع المرئي؟</w:t>
       </w:r>
     </w:p>
     <w:p>
@@ -2041,7 +2064,7 @@
           <w:rtl/>
           <w:lang w:bidi="ar-KW"/>
         </w:rPr>
-        <w:t xml:space="preserve">لماذا يُضيف سائقو السيارات مادة مضادة للتجمّد (Anti-gel) إلى مبرّد السيارة؟</w:t>
+        <w:t xml:space="preserve">لماذا يُرشّ الملح على الطرقات في المناطق الباردة؟ ولماذا يُضاف مضاد التجمّد إلى مبرّد السيارة؟</w:t>
       </w:r>
     </w:p>
     <w:p>
@@ -2069,102 +2092,7 @@
           <w:rtl/>
           <w:lang w:bidi="ar-KW"/>
         </w:rPr>
-        <w:t xml:space="preserve">نُضيف كميات صغيرة من الملح إلى ماء الطهي لتحسين المذاق، فهل للملح تأثير آخر على الماء؟</w:t>
-      </w:r>
-    </w:p>
-    <w:p>
-      <w:pPr>
-        <w:spacing w:after="120" w:line="360" w:lineRule="auto"/>
-        <w:jc w:val="both"/>
-        <w:rPr>
-          <w:rFonts w:asciiTheme="majorBidi" w:hAnsiTheme="majorBidi" w:cstheme="majorBidi"/>
-          <w:sz w:val="28"/>
-          <w:szCs w:val="28"/>
-          <w:rtl/>
-          <w:lang w:bidi="ar-KW"/>
-        </w:rPr>
-      </w:pPr>
-      <w:r>
-        <w:rPr>
-          <w:rFonts w:asciiTheme="majorBidi" w:hAnsiTheme="majorBidi" w:cstheme="majorBidi"/>
-          <w:sz w:val="28"/>
-          <w:szCs w:val="28"/>
-          <w:rtl/>
-          <w:lang w:bidi="ar-KW"/>
-        </w:rPr>
-        <w:t xml:space="preserve">أستمع إلى إجابات الطالبات وأدوّن أبرزها على السبورة دون الحكم عليها، ثم أوضّح لهن أن إضافة مادة مذابة إلى مذيب تُغيّر بعض خواصه الفيزيائية، وأن هذه التغيّرات تُعرف بـ </w:t>
-      </w:r>
-      <w:r>
-        <w:rPr>
-          <w:rFonts w:asciiTheme="majorBidi" w:hAnsiTheme="majorBidi" w:cstheme="majorBidi"/>
-          <w:b/>
-          <w:bCs/>
-          <w:sz w:val="28"/>
-          <w:szCs w:val="28"/>
-          <w:rtl/>
-          <w:lang w:bidi="ar-KW"/>
-        </w:rPr>
-        <w:t xml:space="preserve">الخواص المجمّعة للمحاليل</w:t>
-      </w:r>
-      <w:r>
-        <w:rPr>
-          <w:rFonts w:asciiTheme="majorBidi" w:hAnsiTheme="majorBidi" w:cstheme="majorBidi"/>
-          <w:sz w:val="28"/>
-          <w:szCs w:val="28"/>
-          <w:rtl/>
-          <w:lang w:bidi="ar-KW"/>
-        </w:rPr>
-        <w:t xml:space="preserve">، وأننا سنتعرّف اليوم على أولى هذه الخواص.</w:t>
-      </w:r>
-    </w:p>
-    <w:p>
-      <w:pPr>
-        <w:keepNext/>
-        <w:spacing w:after="60" w:line="360" w:lineRule="auto"/>
-        <w:jc w:val="both"/>
-        <w:rPr>
-          <w:rFonts w:asciiTheme="majorBidi" w:hAnsiTheme="majorBidi" w:cstheme="majorBidi"/>
-          <w:sz w:val="28"/>
-          <w:szCs w:val="28"/>
-          <w:rtl/>
-          <w:lang w:bidi="ar-KW"/>
-        </w:rPr>
-      </w:pPr>
-      <w:r>
-        <w:rPr>
-          <w:rFonts w:asciiTheme="majorBidi" w:hAnsiTheme="majorBidi" w:cstheme="majorBidi"/>
-          <w:b/>
-          <w:bCs/>
-          <w:color w:val="1F4E79"/>
-          <w:sz w:val="28"/>
-          <w:szCs w:val="28"/>
-          <w:rtl/>
-          <w:lang w:bidi="ar-KW"/>
-        </w:rPr>
-        <w:t xml:space="preserve">2- لعبة إلكترونية (مختبر افتراضي):</w:t>
-      </w:r>
-    </w:p>
-    <w:p>
-      <w:pPr>
-        <w:spacing w:after="0" w:line="360" w:lineRule="auto"/>
-        <w:jc w:val="both"/>
-        <w:rPr>
-          <w:rFonts w:asciiTheme="majorBidi" w:hAnsiTheme="majorBidi" w:cstheme="majorBidi"/>
-          <w:sz w:val="28"/>
-          <w:szCs w:val="28"/>
-          <w:rtl/>
-          <w:lang w:bidi="ar-KW"/>
-        </w:rPr>
-      </w:pPr>
-      <w:r>
-        <w:rPr>
-          <w:rFonts w:asciiTheme="majorBidi" w:hAnsiTheme="majorBidi" w:cstheme="majorBidi"/>
-          <w:sz w:val="28"/>
-          <w:szCs w:val="28"/>
-          <w:rtl/>
-          <w:lang w:bidi="ar-KW"/>
-        </w:rPr>
-        <w:t xml:space="preserve">باستخدام استراتيجية التعلّم باللعب والمختبر الافتراضي، أعرض على الطالبات لعبة إلكترونية (مختبر افتراضي) خاصة بالانخفاض في الضغط البخاري، حيث تعمل الطالبات على استنتاج مفهوم الضغط البخاري وماذا يحدث للضغط البخاري عند إضافة مذاب في مذيب، وذلك من خلال الخطوات التالية:</w:t>
+        <w:t xml:space="preserve">هل للملح تأثير آخر على ماء الطهي غير تحسين المذاق؟</w:t>
       </w:r>
     </w:p>
     <w:p>
@@ -2192,7 +2120,161 @@
           <w:rtl/>
           <w:lang w:bidi="ar-KW"/>
         </w:rPr>
-        <w:t xml:space="preserve">تلاحظ الطالبات وعاءً مغلقًا يحتوي على ماء نقي ومتّصلًا بمقياس للضغط، وتراقب جزيئات الماء وهي تتبخّر وتتكاثف حتى تثبت قراءة المقياس عند حدوث حالة اتزان بين السائل وبخاره.</w:t>
+        <w:t xml:space="preserve">أي الوعاءين تصاعد منه بخار أكثر؟ وما الذي اختلف بينهما؟</w:t>
+      </w:r>
+    </w:p>
+    <w:p>
+      <w:pPr>
+        <w:spacing w:after="160" w:line="360" w:lineRule="auto"/>
+        <w:jc w:val="both"/>
+        <w:rPr>
+          <w:rFonts w:asciiTheme="majorBidi" w:hAnsiTheme="majorBidi" w:cstheme="majorBidi"/>
+          <w:sz w:val="28"/>
+          <w:szCs w:val="28"/>
+          <w:rtl/>
+          <w:lang w:bidi="ar-KW"/>
+        </w:rPr>
+      </w:pPr>
+      <w:r>
+        <w:rPr>
+          <w:rFonts w:asciiTheme="majorBidi" w:hAnsiTheme="majorBidi" w:cstheme="majorBidi"/>
+          <w:sz w:val="28"/>
+          <w:szCs w:val="28"/>
+          <w:rtl/>
+          <w:lang w:bidi="ar-KW"/>
+        </w:rPr>
+        <w:t xml:space="preserve">أستمع إلى ملاحظات الطالبات واستنتاجاتهن وأدوّن أبرزها على السبورة دون الحكم عليها، ثم أوضّح لهن أن إضافة مادة مذابة إلى مذيب تُغيّر بعض خواصه الفيزيائية، وأن هذه التغيّرات تُعرف بـ </w:t>
+      </w:r>
+      <w:r>
+        <w:rPr>
+          <w:rFonts w:asciiTheme="majorBidi" w:hAnsiTheme="majorBidi" w:cstheme="majorBidi"/>
+          <w:b/>
+          <w:bCs/>
+          <w:sz w:val="28"/>
+          <w:szCs w:val="28"/>
+          <w:rtl/>
+          <w:lang w:bidi="ar-KW"/>
+        </w:rPr>
+        <w:t xml:space="preserve">الخواص المجمّعة للمحاليل</w:t>
+      </w:r>
+      <w:r>
+        <w:rPr>
+          <w:rFonts w:asciiTheme="majorBidi" w:hAnsiTheme="majorBidi" w:cstheme="majorBidi"/>
+          <w:sz w:val="28"/>
+          <w:szCs w:val="28"/>
+          <w:rtl/>
+          <w:lang w:bidi="ar-KW"/>
+        </w:rPr>
+        <w:t xml:space="preserve">، ثم أكتب عنوان الدرس على السبورة: </w:t>
+      </w:r>
+      <w:r>
+        <w:rPr>
+          <w:rFonts w:asciiTheme="majorBidi" w:hAnsiTheme="majorBidi" w:cstheme="majorBidi"/>
+          <w:b/>
+          <w:bCs/>
+          <w:color w:val="1F4E79"/>
+          <w:sz w:val="28"/>
+          <w:szCs w:val="28"/>
+          <w:rtl/>
+          <w:lang w:bidi="ar-KW"/>
+        </w:rPr>
+        <w:t xml:space="preserve">«الانخفاض في الضغط البخاري»</w:t>
+      </w:r>
+      <w:r>
+        <w:rPr>
+          <w:rFonts w:asciiTheme="majorBidi" w:hAnsiTheme="majorBidi" w:cstheme="majorBidi"/>
+          <w:sz w:val="28"/>
+          <w:szCs w:val="28"/>
+          <w:rtl/>
+          <w:lang w:bidi="ar-KW"/>
+        </w:rPr>
+        <w:t xml:space="preserve">.</w:t>
+      </w:r>
+    </w:p>
+    <w:p>
+      <w:pPr>
+        <w:spacing w:line="360" w:lineRule="auto"/>
+        <w:rPr>
+          <w:rFonts w:asciiTheme="majorBidi" w:hAnsiTheme="majorBidi" w:cstheme="majorBidi"/>
+          <w:sz w:val="28"/>
+          <w:szCs w:val="28"/>
+          <w:rtl/>
+          <w:lang w:val="en-GB"/>
+        </w:rPr>
+      </w:pPr>
+      <w:r>
+        <w:rPr>
+          <w:rFonts w:asciiTheme="majorBidi" w:hAnsiTheme="majorBidi" w:cstheme="majorBidi" w:hint="cs"/>
+          <w:b/>
+          <w:bCs/>
+          <w:color w:val="FF0000"/>
+          <w:sz w:val="32"/>
+          <w:szCs w:val="32"/>
+          <w:rtl/>
+        </w:rPr>
+        <w:t>علم وطبق</w:t>
+      </w:r>
+      <w:r>
+        <w:rPr>
+          <w:rFonts w:asciiTheme="majorBidi" w:hAnsiTheme="majorBidi" w:cstheme="majorBidi"/>
+          <w:b/>
+          <w:bCs/>
+          <w:color w:val="FF0000"/>
+          <w:sz w:val="32"/>
+          <w:szCs w:val="32"/>
+          <w:rtl/>
+        </w:rPr>
+        <w:t>:</w:t>
+      </w:r>
+    </w:p>
+    <w:p>
+      <w:pPr>
+        <w:keepNext/>
+        <w:spacing w:after="60" w:line="360" w:lineRule="auto"/>
+        <w:jc w:val="both"/>
+        <w:rPr>
+          <w:rFonts w:asciiTheme="majorBidi" w:hAnsiTheme="majorBidi" w:cstheme="majorBidi"/>
+          <w:sz w:val="28"/>
+          <w:szCs w:val="28"/>
+          <w:rtl/>
+          <w:lang w:bidi="ar-KW"/>
+        </w:rPr>
+      </w:pPr>
+      <w:r>
+        <w:rPr>
+          <w:rFonts w:asciiTheme="majorBidi" w:hAnsiTheme="majorBidi" w:cstheme="majorBidi"/>
+          <w:b/>
+          <w:bCs/>
+          <w:color w:val="1F4E79"/>
+          <w:sz w:val="28"/>
+          <w:szCs w:val="28"/>
+          <w:rtl/>
+          <w:lang w:bidi="ar-KW"/>
+        </w:rPr>
+        <w:t xml:space="preserve">أولًا: الخواص المجمّعة (استخلاص المعرفة):</w:t>
+      </w:r>
+    </w:p>
+    <w:p>
+      <w:pPr>
+        <w:spacing w:after="0" w:line="360" w:lineRule="auto"/>
+        <w:jc w:val="both"/>
+        <w:rPr>
+          <w:rFonts w:asciiTheme="majorBidi" w:hAnsiTheme="majorBidi" w:cstheme="majorBidi"/>
+          <w:sz w:val="28"/>
+          <w:szCs w:val="28"/>
+          <w:rtl/>
+          <w:lang w:bidi="ar-KW"/>
+        </w:rPr>
+      </w:pPr>
+      <w:r>
+        <w:rPr>
+          <w:rFonts w:asciiTheme="majorBidi" w:hAnsiTheme="majorBidi" w:cstheme="majorBidi"/>
+          <w:sz w:val="28"/>
+          <w:szCs w:val="28"/>
+          <w:rtl/>
+          <w:lang w:bidi="ar-KW"/>
+        </w:rPr>
+        <w:t xml:space="preserve">باستخدام استراتيجية استخلاص المعرفة، أطلب من الطالبات قراءة فقرة «الخواص المجمّعة» في الكتاب المدرسي صفحة (70) والتوصّل إلى أن:</w:t>
       </w:r>
     </w:p>
     <w:p>
@@ -2220,7 +2302,7 @@
           <w:rtl/>
           <w:lang w:bidi="ar-KW"/>
         </w:rPr>
-        <w:t xml:space="preserve">تُضيف الطالبات كمية من مذاب غير متطاير وغير إلكتروليتي (مثل السكر) إلى الماء، وتلاحظ التغيّر في قراءة مقياس الضغط.</w:t>
+        <w:t xml:space="preserve">معظم المحاليل التي تُحضَّر في المختبر يُستخدم فيها الماء المقطّر كمذيب، وهذا السائل له درجة تجمّد ثابتة (0 °C) ودرجة غليان ثابتة (100 °C).</w:t>
       </w:r>
     </w:p>
     <w:p>
@@ -2248,161 +2330,7 @@
           <w:rtl/>
           <w:lang w:bidi="ar-KW"/>
         </w:rPr>
-        <w:t xml:space="preserve">تزيد الطالبات كمية المذاب تدريجيًا وتسجّل ملاحظاتها عن قراءة المقياس.</w:t>
-      </w:r>
-    </w:p>
-    <w:p>
-      <w:pPr>
-        <w:spacing w:after="160" w:line="360" w:lineRule="auto"/>
-        <w:jc w:val="both"/>
-        <w:rPr>
-          <w:rFonts w:asciiTheme="majorBidi" w:hAnsiTheme="majorBidi" w:cstheme="majorBidi"/>
-          <w:sz w:val="28"/>
-          <w:szCs w:val="28"/>
-          <w:rtl/>
-          <w:lang w:bidi="ar-KW"/>
-        </w:rPr>
-      </w:pPr>
-      <w:r>
-        <w:rPr>
-          <w:rFonts w:asciiTheme="majorBidi" w:hAnsiTheme="majorBidi" w:cstheme="majorBidi"/>
-          <w:sz w:val="28"/>
-          <w:szCs w:val="28"/>
-          <w:rtl/>
-          <w:lang w:bidi="ar-KW"/>
-        </w:rPr>
-        <w:t xml:space="preserve">بعد انتهاء النشاط وباستخدام استراتيجية فكّر – زاوج – شارك أطرح السؤالين: ماذا نسمّي ضغط البخار عند حدوث حالة الاتزان؟ وماذا حدث لقراءة المقياس بعد إضافة المذاب؟ لتتوصّل الطالبات إلى أن </w:t>
-      </w:r>
-      <w:r>
-        <w:rPr>
-          <w:rFonts w:asciiTheme="majorBidi" w:hAnsiTheme="majorBidi" w:cstheme="majorBidi"/>
-          <w:b/>
-          <w:bCs/>
-          <w:sz w:val="28"/>
-          <w:szCs w:val="28"/>
-          <w:rtl/>
-          <w:lang w:bidi="ar-KW"/>
-        </w:rPr>
-        <w:t xml:space="preserve">الضغط البخاري للمحلول أقل من الضغط البخاري للماء النقي</w:t>
-      </w:r>
-      <w:r>
-        <w:rPr>
-          <w:rFonts w:asciiTheme="majorBidi" w:hAnsiTheme="majorBidi" w:cstheme="majorBidi"/>
-          <w:sz w:val="28"/>
-          <w:szCs w:val="28"/>
-          <w:rtl/>
-          <w:lang w:bidi="ar-KW"/>
-        </w:rPr>
-        <w:t xml:space="preserve">، ثم أكتب عنوان الدرس على السبورة: </w:t>
-      </w:r>
-      <w:r>
-        <w:rPr>
-          <w:rFonts w:asciiTheme="majorBidi" w:hAnsiTheme="majorBidi" w:cstheme="majorBidi"/>
-          <w:b/>
-          <w:bCs/>
-          <w:color w:val="1F4E79"/>
-          <w:sz w:val="28"/>
-          <w:szCs w:val="28"/>
-          <w:rtl/>
-          <w:lang w:bidi="ar-KW"/>
-        </w:rPr>
-        <w:t xml:space="preserve">«الانخفاض في الضغط البخاري»</w:t>
-      </w:r>
-      <w:r>
-        <w:rPr>
-          <w:rFonts w:asciiTheme="majorBidi" w:hAnsiTheme="majorBidi" w:cstheme="majorBidi"/>
-          <w:sz w:val="28"/>
-          <w:szCs w:val="28"/>
-          <w:rtl/>
-          <w:lang w:bidi="ar-KW"/>
-        </w:rPr>
-        <w:t xml:space="preserve">.</w:t>
-      </w:r>
-    </w:p>
-    <w:p>
-      <w:pPr>
-        <w:spacing w:line="360" w:lineRule="auto"/>
-        <w:rPr>
-          <w:rFonts w:asciiTheme="majorBidi" w:hAnsiTheme="majorBidi" w:cstheme="majorBidi"/>
-          <w:sz w:val="28"/>
-          <w:szCs w:val="28"/>
-          <w:rtl/>
-          <w:lang w:val="en-GB"/>
-        </w:rPr>
-      </w:pPr>
-      <w:r>
-        <w:rPr>
-          <w:rFonts w:asciiTheme="majorBidi" w:hAnsiTheme="majorBidi" w:cstheme="majorBidi" w:hint="cs"/>
-          <w:b/>
-          <w:bCs/>
-          <w:color w:val="FF0000"/>
-          <w:sz w:val="32"/>
-          <w:szCs w:val="32"/>
-          <w:rtl/>
-        </w:rPr>
-        <w:t>علم وطبق</w:t>
-      </w:r>
-      <w:r>
-        <w:rPr>
-          <w:rFonts w:asciiTheme="majorBidi" w:hAnsiTheme="majorBidi" w:cstheme="majorBidi"/>
-          <w:b/>
-          <w:bCs/>
-          <w:color w:val="FF0000"/>
-          <w:sz w:val="32"/>
-          <w:szCs w:val="32"/>
-          <w:rtl/>
-        </w:rPr>
-        <w:t>:</w:t>
-      </w:r>
-    </w:p>
-    <w:p>
-      <w:pPr>
-        <w:keepNext/>
-        <w:spacing w:after="60" w:line="360" w:lineRule="auto"/>
-        <w:jc w:val="both"/>
-        <w:rPr>
-          <w:rFonts w:asciiTheme="majorBidi" w:hAnsiTheme="majorBidi" w:cstheme="majorBidi"/>
-          <w:sz w:val="28"/>
-          <w:szCs w:val="28"/>
-          <w:rtl/>
-          <w:lang w:bidi="ar-KW"/>
-        </w:rPr>
-      </w:pPr>
-      <w:r>
-        <w:rPr>
-          <w:rFonts w:asciiTheme="majorBidi" w:hAnsiTheme="majorBidi" w:cstheme="majorBidi"/>
-          <w:b/>
-          <w:bCs/>
-          <w:color w:val="1F4E79"/>
-          <w:sz w:val="28"/>
-          <w:szCs w:val="28"/>
-          <w:rtl/>
-          <w:lang w:bidi="ar-KW"/>
-        </w:rPr>
-        <w:t xml:space="preserve">أولًا: الخواص المجمّعة (استخلاص المعرفة):</w:t>
-      </w:r>
-    </w:p>
-    <w:p>
-      <w:pPr>
-        <w:spacing w:after="0" w:line="360" w:lineRule="auto"/>
-        <w:jc w:val="both"/>
-        <w:rPr>
-          <w:rFonts w:asciiTheme="majorBidi" w:hAnsiTheme="majorBidi" w:cstheme="majorBidi"/>
-          <w:sz w:val="28"/>
-          <w:szCs w:val="28"/>
-          <w:rtl/>
-          <w:lang w:bidi="ar-KW"/>
-        </w:rPr>
-      </w:pPr>
-      <w:r>
-        <w:rPr>
-          <w:rFonts w:asciiTheme="majorBidi" w:hAnsiTheme="majorBidi" w:cstheme="majorBidi"/>
-          <w:sz w:val="28"/>
-          <w:szCs w:val="28"/>
-          <w:rtl/>
-          <w:lang w:bidi="ar-KW"/>
-        </w:rPr>
-        <w:t xml:space="preserve">باستخدام استراتيجية استخلاص المعرفة، أطلب من الطالبات قراءة فقرة «الخواص المجمّعة» في الكتاب المدرسي صفحة (70) والتوصّل إلى أن:</w:t>
+        <w:t xml:space="preserve">إضافة مذاب إلى مذيب تُغيّر الخواص الفيزيائية لهذا السائل.</w:t>
       </w:r>
     </w:p>
     <w:p>
@@ -2425,12 +2353,24 @@
       <w:r>
         <w:rPr>
           <w:rFonts w:asciiTheme="majorBidi" w:hAnsiTheme="majorBidi" w:cstheme="majorBidi"/>
-          <w:sz w:val="28"/>
-          <w:szCs w:val="28"/>
-          <w:rtl/>
-          <w:lang w:bidi="ar-KW"/>
-        </w:rPr>
-        <w:t xml:space="preserve">معظم المحاليل التي تُحضَّر في المختبر يُستخدم فيها الماء المقطّر كمذيب، وهذا السائل له درجة تجمّد ثابتة (0 °C) ودرجة غليان ثابتة (100 °C).</w:t>
+          <w:b/>
+          <w:bCs/>
+          <w:sz w:val="28"/>
+          <w:szCs w:val="28"/>
+          <w:rtl/>
+          <w:lang w:bidi="ar-KW"/>
+        </w:rPr>
+        <w:t xml:space="preserve">الخواص المجمّعة (التجمّعية) Colligative Properties: </w:t>
+      </w:r>
+      <w:r>
+        <w:rPr>
+          <w:rFonts w:asciiTheme="majorBidi" w:hAnsiTheme="majorBidi" w:cstheme="majorBidi"/>
+          <w:sz w:val="28"/>
+          <w:szCs w:val="28"/>
+          <w:rtl/>
+          <w:lang w:bidi="ar-KW"/>
+        </w:rPr>
+        <w:t xml:space="preserve">هي التغيّرات التي تحدث للخواص الفيزيائية للسائل المذيب عند إضافة المذاب إليه، وهي تتأثر بعدد جزيئات المذاب بالنسبة إلى عدد جزيئات المذيب ولا تتأثر بنوع جزيئات المذاب (في محلول يحتوي على مواد غير إلكتروليتية وغير متطايرة).</w:t>
       </w:r>
     </w:p>
     <w:p>
@@ -2458,7 +2398,80 @@
           <w:rtl/>
           <w:lang w:bidi="ar-KW"/>
         </w:rPr>
-        <w:t xml:space="preserve">إضافة مذاب إلى مذيب تُغيّر الخواص الفيزيائية لهذا السائل.</w:t>
+        <w:t xml:space="preserve">غالبًا ما تكون هذه التغيّرات قيمًا صغيرة للغاية، ومن هذه الخواص: الانخفاض في الضغط البخاري.</w:t>
+      </w:r>
+    </w:p>
+    <w:p>
+      <w:pPr>
+        <w:spacing w:after="60" w:line="360" w:lineRule="auto"/>
+        <w:jc w:val="both"/>
+        <w:rPr>
+          <w:rFonts w:asciiTheme="majorBidi" w:hAnsiTheme="majorBidi" w:cstheme="majorBidi"/>
+          <w:sz w:val="28"/>
+          <w:szCs w:val="28"/>
+          <w:rtl/>
+          <w:lang w:bidi="ar-KW"/>
+        </w:rPr>
+      </w:pPr>
+      <w:r>
+        <w:rPr>
+          <w:rFonts w:asciiTheme="majorBidi" w:hAnsiTheme="majorBidi" w:cstheme="majorBidi"/>
+          <w:sz w:val="28"/>
+          <w:szCs w:val="28"/>
+          <w:rtl/>
+          <w:lang w:bidi="ar-KW"/>
+        </w:rPr>
+        <w:t xml:space="preserve"/>
+      </w:r>
+    </w:p>
+    <w:p>
+      <w:pPr>
+        <w:keepNext/>
+        <w:spacing w:after="60" w:line="360" w:lineRule="auto"/>
+        <w:jc w:val="both"/>
+        <w:rPr>
+          <w:rFonts w:asciiTheme="majorBidi" w:hAnsiTheme="majorBidi" w:cstheme="majorBidi"/>
+          <w:sz w:val="28"/>
+          <w:szCs w:val="28"/>
+          <w:rtl/>
+          <w:lang w:bidi="ar-KW"/>
+        </w:rPr>
+      </w:pPr>
+      <w:r>
+        <w:rPr>
+          <w:rFonts w:asciiTheme="majorBidi" w:hAnsiTheme="majorBidi" w:cstheme="majorBidi"/>
+          <w:b/>
+          <w:bCs/>
+          <w:color w:val="1F4E79"/>
+          <w:sz w:val="28"/>
+          <w:szCs w:val="28"/>
+          <w:rtl/>
+          <w:lang w:bidi="ar-KW"/>
+        </w:rPr>
+        <w:t xml:space="preserve">ثانيًا: مفهوم الضغط البخاري (العرض التقديمي والمناقشة):</w:t>
+      </w:r>
+    </w:p>
+    <w:p>
+      <w:pPr>
+        <w:spacing w:after="0" w:line="360" w:lineRule="auto"/>
+        <w:jc w:val="both"/>
+        <w:rPr>
+          <w:rFonts w:asciiTheme="majorBidi" w:hAnsiTheme="majorBidi" w:cstheme="majorBidi"/>
+          <w:sz w:val="28"/>
+          <w:szCs w:val="28"/>
+          <w:rtl/>
+          <w:lang w:bidi="ar-KW"/>
+        </w:rPr>
+      </w:pPr>
+      <w:r>
+        <w:rPr>
+          <w:rFonts w:asciiTheme="majorBidi" w:hAnsiTheme="majorBidi" w:cstheme="majorBidi"/>
+          <w:sz w:val="28"/>
+          <w:szCs w:val="28"/>
+          <w:rtl/>
+          <w:lang w:bidi="ar-KW"/>
+        </w:rPr>
+        <w:t xml:space="preserve">باستخدام استراتيجية المناقشة ومن خلال العرض التقديمي، أعرض على الطالبات صورة لوعاء مغلق يحتوي على سائل، وأناقشهن في أن بعض جزيئات السائل تتبخّر وتنتقل إلى الحالة الغازية، وفي الوقت نفسه تعود بعض جزيئات البخار إلى الحالة السائلة (التكاثف)، وعندما يتساوى معدّل التبخّر مع معدّل التكاثف تحدث حالة اتزان بين السائل وبخاره، لنتوصّل معًا إلى أن:</w:t>
       </w:r>
     </w:p>
     <w:p>
@@ -2488,17 +2501,17 @@
           <w:rtl/>
           <w:lang w:bidi="ar-KW"/>
         </w:rPr>
-        <w:t xml:space="preserve">الخواص المجمّعة (التجمّعية) Colligative Properties: </w:t>
-      </w:r>
-      <w:r>
-        <w:rPr>
-          <w:rFonts w:asciiTheme="majorBidi" w:hAnsiTheme="majorBidi" w:cstheme="majorBidi"/>
-          <w:sz w:val="28"/>
-          <w:szCs w:val="28"/>
-          <w:rtl/>
-          <w:lang w:bidi="ar-KW"/>
-        </w:rPr>
-        <w:t xml:space="preserve">هي التغيّرات التي تحدث للخواص الفيزيائية للسائل المذيب عند إضافة المذاب إليه، وهي تتأثر بعدد جزيئات المذاب بالنسبة إلى عدد جزيئات المذيب ولا تتأثر بنوع جزيئات المذاب (في محلول يحتوي على مواد غير إلكتروليتية وغير متطايرة).</w:t>
+        <w:t xml:space="preserve">الضغط البخاري: </w:t>
+      </w:r>
+      <w:r>
+        <w:rPr>
+          <w:rFonts w:asciiTheme="majorBidi" w:hAnsiTheme="majorBidi" w:cstheme="majorBidi"/>
+          <w:sz w:val="28"/>
+          <w:szCs w:val="28"/>
+          <w:rtl/>
+          <w:lang w:bidi="ar-KW"/>
+        </w:rPr>
+        <w:t xml:space="preserve">هو ضغط البخار على السائل عند حدوث حالة اتزان بين السائل وبخاره عند درجة حرارة معيّنة.</w:t>
       </w:r>
     </w:p>
     <w:p>
@@ -2526,7 +2539,7 @@
           <w:rtl/>
           <w:lang w:bidi="ar-KW"/>
         </w:rPr>
-        <w:t xml:space="preserve">غالبًا ما تكون هذه التغيّرات قيمًا صغيرة للغاية، ومن هذه الخواص: الانخفاض في الضغط البخاري.</w:t>
+        <w:t xml:space="preserve">لكلّ سائل نقي ضغط بخاري معيّن عند درجة حرارة معيّنة.</w:t>
       </w:r>
     </w:p>
     <w:p>
@@ -2576,7 +2589,7 @@
           <w:rtl/>
           <w:lang w:bidi="ar-KW"/>
         </w:rPr>
-        <w:t xml:space="preserve">ثانيًا: مفهوم الضغط البخاري (العرض التقديمي والمناقشة):</w:t>
+        <w:t xml:space="preserve">ثالثًا: قراءة الرسم البياني – شكل (46 أ) (فكّر – زاوج – شارك):</w:t>
       </w:r>
     </w:p>
     <w:p>
@@ -2599,148 +2612,7 @@
           <w:rtl/>
           <w:lang w:bidi="ar-KW"/>
         </w:rPr>
-        <w:t xml:space="preserve">من خلال العرض التقديمي أعرض على الطالبات صورة لوعاء مغلق يحتوي على سائل، وأناقشهن في أن بعض جزيئات السائل تتبخّر وتنتقل إلى الحالة الغازية، وفي الوقت نفسه تعود بعض جزيئات البخار إلى الحالة السائلة (التكاثف)، وعندما يتساوى معدّل التبخّر مع معدّل التكاثف تحدث حالة اتزان بين السائل وبخاره، لنتوصّل معًا إلى أن:</w:t>
-      </w:r>
-    </w:p>
-    <w:p>
-      <w:pPr>
-        <w:pStyle w:val="ListParagraph"/>
-        <w:numPr>
-          <w:ilvl w:val="0"/>
-          <w:numId w:val="32"/>
-        </w:numPr>
-        <w:spacing w:after="0" w:line="360" w:lineRule="auto"/>
-        <w:jc w:val="both"/>
-        <w:rPr>
-          <w:rFonts w:asciiTheme="majorBidi" w:hAnsiTheme="majorBidi" w:cstheme="majorBidi"/>
-          <w:sz w:val="28"/>
-          <w:szCs w:val="28"/>
-          <w:rtl/>
-          <w:lang w:bidi="ar-KW"/>
-        </w:rPr>
-      </w:pPr>
-      <w:r>
-        <w:rPr>
-          <w:rFonts w:asciiTheme="majorBidi" w:hAnsiTheme="majorBidi" w:cstheme="majorBidi"/>
-          <w:b/>
-          <w:bCs/>
-          <w:sz w:val="28"/>
-          <w:szCs w:val="28"/>
-          <w:rtl/>
-          <w:lang w:bidi="ar-KW"/>
-        </w:rPr>
-        <w:t xml:space="preserve">الضغط البخاري: </w:t>
-      </w:r>
-      <w:r>
-        <w:rPr>
-          <w:rFonts w:asciiTheme="majorBidi" w:hAnsiTheme="majorBidi" w:cstheme="majorBidi"/>
-          <w:sz w:val="28"/>
-          <w:szCs w:val="28"/>
-          <w:rtl/>
-          <w:lang w:bidi="ar-KW"/>
-        </w:rPr>
-        <w:t xml:space="preserve">هو ضغط البخار على السائل عند حدوث حالة اتزان بين السائل وبخاره عند درجة حرارة معيّنة.</w:t>
-      </w:r>
-    </w:p>
-    <w:p>
-      <w:pPr>
-        <w:pStyle w:val="ListParagraph"/>
-        <w:numPr>
-          <w:ilvl w:val="0"/>
-          <w:numId w:val="32"/>
-        </w:numPr>
-        <w:spacing w:after="0" w:line="360" w:lineRule="auto"/>
-        <w:jc w:val="both"/>
-        <w:rPr>
-          <w:rFonts w:asciiTheme="majorBidi" w:hAnsiTheme="majorBidi" w:cstheme="majorBidi"/>
-          <w:sz w:val="28"/>
-          <w:szCs w:val="28"/>
-          <w:rtl/>
-          <w:lang w:bidi="ar-KW"/>
-        </w:rPr>
-      </w:pPr>
-      <w:r>
-        <w:rPr>
-          <w:rFonts w:asciiTheme="majorBidi" w:hAnsiTheme="majorBidi" w:cstheme="majorBidi"/>
-          <w:sz w:val="28"/>
-          <w:szCs w:val="28"/>
-          <w:rtl/>
-          <w:lang w:bidi="ar-KW"/>
-        </w:rPr>
-        <w:t xml:space="preserve">لكلّ سائل نقي ضغط بخاري معيّن عند درجة حرارة معيّنة.</w:t>
-      </w:r>
-    </w:p>
-    <w:p>
-      <w:pPr>
-        <w:spacing w:after="60" w:line="360" w:lineRule="auto"/>
-        <w:jc w:val="both"/>
-        <w:rPr>
-          <w:rFonts w:asciiTheme="majorBidi" w:hAnsiTheme="majorBidi" w:cstheme="majorBidi"/>
-          <w:sz w:val="28"/>
-          <w:szCs w:val="28"/>
-          <w:rtl/>
-          <w:lang w:bidi="ar-KW"/>
-        </w:rPr>
-      </w:pPr>
-      <w:r>
-        <w:rPr>
-          <w:rFonts w:asciiTheme="majorBidi" w:hAnsiTheme="majorBidi" w:cstheme="majorBidi"/>
-          <w:sz w:val="28"/>
-          <w:szCs w:val="28"/>
-          <w:rtl/>
-          <w:lang w:bidi="ar-KW"/>
-        </w:rPr>
-        <w:t xml:space="preserve"/>
-      </w:r>
-    </w:p>
-    <w:p>
-      <w:pPr>
-        <w:keepNext/>
-        <w:spacing w:after="60" w:line="360" w:lineRule="auto"/>
-        <w:jc w:val="both"/>
-        <w:rPr>
-          <w:rFonts w:asciiTheme="majorBidi" w:hAnsiTheme="majorBidi" w:cstheme="majorBidi"/>
-          <w:sz w:val="28"/>
-          <w:szCs w:val="28"/>
-          <w:rtl/>
-          <w:lang w:bidi="ar-KW"/>
-        </w:rPr>
-      </w:pPr>
-      <w:r>
-        <w:rPr>
-          <w:rFonts w:asciiTheme="majorBidi" w:hAnsiTheme="majorBidi" w:cstheme="majorBidi"/>
-          <w:b/>
-          <w:bCs/>
-          <w:color w:val="1F4E79"/>
-          <w:sz w:val="28"/>
-          <w:szCs w:val="28"/>
-          <w:rtl/>
-          <w:lang w:bidi="ar-KW"/>
-        </w:rPr>
-        <w:t xml:space="preserve">ثالثًا: قراءة الرسم البياني – شكل (46 أ) (فكّر – زاوج – شارك):</w:t>
-      </w:r>
-    </w:p>
-    <w:p>
-      <w:pPr>
-        <w:spacing w:after="0" w:line="360" w:lineRule="auto"/>
-        <w:jc w:val="both"/>
-        <w:rPr>
-          <w:rFonts w:asciiTheme="majorBidi" w:hAnsiTheme="majorBidi" w:cstheme="majorBidi"/>
-          <w:sz w:val="28"/>
-          <w:szCs w:val="28"/>
-          <w:rtl/>
-          <w:lang w:bidi="ar-KW"/>
-        </w:rPr>
-      </w:pPr>
-      <w:r>
-        <w:rPr>
-          <w:rFonts w:asciiTheme="majorBidi" w:hAnsiTheme="majorBidi" w:cstheme="majorBidi"/>
-          <w:sz w:val="28"/>
-          <w:szCs w:val="28"/>
-          <w:rtl/>
-          <w:lang w:bidi="ar-KW"/>
-        </w:rPr>
-        <w:t xml:space="preserve">أعرض على الطالبات الرسم البياني التالي الذي يوضّح الضغط البخاري لكلٍّ من الماء وإيثيل الكحول وثنائي إيثيل إيثر مع تغيّر درجة الحرارة، وباستخدام استراتيجية فكّر – زاوج – شارك أطرح عليهن الأسئلة التالية:</w:t>
+        <w:t xml:space="preserve">باستخدام استراتيجية فكّر – زاوج – شارك، أعرض على الطالبات الرسم البياني التالي الذي يوضّح الضغط البخاري لكلٍّ من الماء وإيثيل الكحول وثنائي إيثيل إيثر مع تغيّر درجة الحرارة، وأناقشهن في الأسئلة التالية:</w:t>
       </w:r>
     </w:p>
     <w:p>
@@ -3107,7 +2979,7 @@
           <w:rtl/>
           <w:lang w:bidi="ar-KW"/>
         </w:rPr>
-        <w:t xml:space="preserve">رابعًا: الانخفاض في الضغط البخاري Decrease in Vapour Pressure (استخلاص المعرفة):</w:t>
+        <w:t xml:space="preserve">رابعًا: المختبر الافتراضي – لعبة إلكترونية (التعلّم باللعب):</w:t>
       </w:r>
     </w:p>
     <w:p>
@@ -3130,7 +3002,223 @@
           <w:rtl/>
           <w:lang w:bidi="ar-KW"/>
         </w:rPr>
-        <w:t xml:space="preserve">أطلب من الطالبات قراءة فقرة «الانخفاض في الضغط البخاري» في الكتاب المدرسي صفحة (71)، والاستعانة بنتائج المختبر الافتراضي، للإجابة عن السؤال: ماذا يحدث عند إذابة مادة غير متطايرة وغير إلكتروليتية (مركّب تساهمي) في مذيب سائل؟ ثم أعرض عليهن الرسم البياني التالي من خلال العرض التقديمي لنتوصّل إلى أن:</w:t>
+        <w:t xml:space="preserve">باستخدام استراتيجية التعلّم باللعب والمختبر الافتراضي، أعرض على الطالبات لعبة إلكترونية (مختبر افتراضي) خاصة بالانخفاض في الضغط البخاري، حيث تعمل الطالبات على استنتاج مفهوم الضغط البخاري وماذا يحدث للضغط البخاري عند إضافة مذاب في مذيب، وذلك من خلال الخطوات التالية:</w:t>
+      </w:r>
+    </w:p>
+    <w:p>
+      <w:pPr>
+        <w:pStyle w:val="ListParagraph"/>
+        <w:numPr>
+          <w:ilvl w:val="0"/>
+          <w:numId w:val="32"/>
+        </w:numPr>
+        <w:spacing w:after="0" w:line="360" w:lineRule="auto"/>
+        <w:jc w:val="both"/>
+        <w:rPr>
+          <w:rFonts w:asciiTheme="majorBidi" w:hAnsiTheme="majorBidi" w:cstheme="majorBidi"/>
+          <w:sz w:val="28"/>
+          <w:szCs w:val="28"/>
+          <w:rtl/>
+          <w:lang w:bidi="ar-KW"/>
+        </w:rPr>
+      </w:pPr>
+      <w:r>
+        <w:rPr>
+          <w:rFonts w:asciiTheme="majorBidi" w:hAnsiTheme="majorBidi" w:cstheme="majorBidi"/>
+          <w:sz w:val="28"/>
+          <w:szCs w:val="28"/>
+          <w:rtl/>
+          <w:lang w:bidi="ar-KW"/>
+        </w:rPr>
+        <w:t xml:space="preserve">تلاحظ الطالبات وعاءً مغلقًا يحتوي على ماء نقي ومتّصلًا بمقياس للضغط، وتراقب جزيئات الماء وهي تتبخّر وتتكاثف حتى تثبت قراءة المقياس عند حدوث حالة اتزان بين السائل وبخاره.</w:t>
+      </w:r>
+    </w:p>
+    <w:p>
+      <w:pPr>
+        <w:pStyle w:val="ListParagraph"/>
+        <w:numPr>
+          <w:ilvl w:val="0"/>
+          <w:numId w:val="32"/>
+        </w:numPr>
+        <w:spacing w:after="0" w:line="360" w:lineRule="auto"/>
+        <w:jc w:val="both"/>
+        <w:rPr>
+          <w:rFonts w:asciiTheme="majorBidi" w:hAnsiTheme="majorBidi" w:cstheme="majorBidi"/>
+          <w:sz w:val="28"/>
+          <w:szCs w:val="28"/>
+          <w:rtl/>
+          <w:lang w:bidi="ar-KW"/>
+        </w:rPr>
+      </w:pPr>
+      <w:r>
+        <w:rPr>
+          <w:rFonts w:asciiTheme="majorBidi" w:hAnsiTheme="majorBidi" w:cstheme="majorBidi"/>
+          <w:sz w:val="28"/>
+          <w:szCs w:val="28"/>
+          <w:rtl/>
+          <w:lang w:bidi="ar-KW"/>
+        </w:rPr>
+        <w:t xml:space="preserve">تُضيف الطالبات كمية من مذاب غير متطاير وغير إلكتروليتي (مثل السكر) إلى الماء، وتلاحظ التغيّر في قراءة مقياس الضغط.</w:t>
+      </w:r>
+    </w:p>
+    <w:p>
+      <w:pPr>
+        <w:pStyle w:val="ListParagraph"/>
+        <w:numPr>
+          <w:ilvl w:val="0"/>
+          <w:numId w:val="32"/>
+        </w:numPr>
+        <w:spacing w:after="0" w:line="360" w:lineRule="auto"/>
+        <w:jc w:val="both"/>
+        <w:rPr>
+          <w:rFonts w:asciiTheme="majorBidi" w:hAnsiTheme="majorBidi" w:cstheme="majorBidi"/>
+          <w:sz w:val="28"/>
+          <w:szCs w:val="28"/>
+          <w:rtl/>
+          <w:lang w:bidi="ar-KW"/>
+        </w:rPr>
+      </w:pPr>
+      <w:r>
+        <w:rPr>
+          <w:rFonts w:asciiTheme="majorBidi" w:hAnsiTheme="majorBidi" w:cstheme="majorBidi"/>
+          <w:sz w:val="28"/>
+          <w:szCs w:val="28"/>
+          <w:rtl/>
+          <w:lang w:bidi="ar-KW"/>
+        </w:rPr>
+        <w:t xml:space="preserve">تزيد الطالبات كمية المذاب تدريجيًا وتسجّل ملاحظاتها عن قراءة المقياس.</w:t>
+      </w:r>
+    </w:p>
+    <w:p>
+      <w:pPr>
+        <w:spacing w:after="0" w:line="360" w:lineRule="auto"/>
+        <w:jc w:val="both"/>
+        <w:rPr>
+          <w:rFonts w:asciiTheme="majorBidi" w:hAnsiTheme="majorBidi" w:cstheme="majorBidi"/>
+          <w:sz w:val="28"/>
+          <w:szCs w:val="28"/>
+          <w:rtl/>
+          <w:lang w:bidi="ar-KW"/>
+        </w:rPr>
+      </w:pPr>
+      <w:r>
+        <w:rPr>
+          <w:rFonts w:asciiTheme="majorBidi" w:hAnsiTheme="majorBidi" w:cstheme="majorBidi"/>
+          <w:sz w:val="28"/>
+          <w:szCs w:val="28"/>
+          <w:rtl/>
+          <w:lang w:bidi="ar-KW"/>
+        </w:rPr>
+        <w:t xml:space="preserve">ثم أناقش الطالبات في السؤالين: ماذا نسمّي ضغط البخار عند حدوث حالة الاتزان؟ </w:t>
+      </w:r>
+      <w:r>
+        <w:rPr>
+          <w:rFonts w:asciiTheme="majorBidi" w:hAnsiTheme="majorBidi" w:cstheme="majorBidi"/>
+          <w:b/>
+          <w:bCs/>
+          <w:color w:val="C00000"/>
+          <w:sz w:val="28"/>
+          <w:szCs w:val="28"/>
+          <w:rtl/>
+          <w:lang w:bidi="ar-KW"/>
+        </w:rPr>
+        <w:t xml:space="preserve">(الضغط البخاري)</w:t>
+      </w:r>
+      <w:r>
+        <w:rPr>
+          <w:rFonts w:asciiTheme="majorBidi" w:hAnsiTheme="majorBidi" w:cstheme="majorBidi"/>
+          <w:sz w:val="28"/>
+          <w:szCs w:val="28"/>
+          <w:rtl/>
+          <w:lang w:bidi="ar-KW"/>
+        </w:rPr>
+        <w:t xml:space="preserve"> وماذا حدث لقراءة المقياس بعد إضافة المذاب؟ </w:t>
+      </w:r>
+      <w:r>
+        <w:rPr>
+          <w:rFonts w:asciiTheme="majorBidi" w:hAnsiTheme="majorBidi" w:cstheme="majorBidi"/>
+          <w:b/>
+          <w:bCs/>
+          <w:color w:val="C00000"/>
+          <w:sz w:val="28"/>
+          <w:szCs w:val="28"/>
+          <w:rtl/>
+          <w:lang w:bidi="ar-KW"/>
+        </w:rPr>
+        <w:t xml:space="preserve">(قلّت؛ أي أن الضغط البخاري انخفض)</w:t>
+      </w:r>
+    </w:p>
+    <w:p>
+      <w:pPr>
+        <w:spacing w:after="60" w:line="360" w:lineRule="auto"/>
+        <w:jc w:val="both"/>
+        <w:rPr>
+          <w:rFonts w:asciiTheme="majorBidi" w:hAnsiTheme="majorBidi" w:cstheme="majorBidi"/>
+          <w:sz w:val="28"/>
+          <w:szCs w:val="28"/>
+          <w:rtl/>
+          <w:lang w:bidi="ar-KW"/>
+        </w:rPr>
+      </w:pPr>
+      <w:r>
+        <w:rPr>
+          <w:rFonts w:asciiTheme="majorBidi" w:hAnsiTheme="majorBidi" w:cstheme="majorBidi"/>
+          <w:sz w:val="28"/>
+          <w:szCs w:val="28"/>
+          <w:rtl/>
+          <w:lang w:bidi="ar-KW"/>
+        </w:rPr>
+        <w:t xml:space="preserve"/>
+      </w:r>
+    </w:p>
+    <w:p>
+      <w:pPr>
+        <w:keepNext/>
+        <w:spacing w:after="60" w:line="360" w:lineRule="auto"/>
+        <w:jc w:val="both"/>
+        <w:rPr>
+          <w:rFonts w:asciiTheme="majorBidi" w:hAnsiTheme="majorBidi" w:cstheme="majorBidi"/>
+          <w:sz w:val="28"/>
+          <w:szCs w:val="28"/>
+          <w:rtl/>
+          <w:lang w:bidi="ar-KW"/>
+        </w:rPr>
+      </w:pPr>
+      <w:r>
+        <w:rPr>
+          <w:rFonts w:asciiTheme="majorBidi" w:hAnsiTheme="majorBidi" w:cstheme="majorBidi"/>
+          <w:b/>
+          <w:bCs/>
+          <w:color w:val="1F4E79"/>
+          <w:sz w:val="28"/>
+          <w:szCs w:val="28"/>
+          <w:rtl/>
+          <w:lang w:bidi="ar-KW"/>
+        </w:rPr>
+        <w:t xml:space="preserve">خامسًا: الانخفاض في الضغط البخاري Decrease in Vapour Pressure (استخلاص المعرفة):</w:t>
+      </w:r>
+    </w:p>
+    <w:p>
+      <w:pPr>
+        <w:spacing w:after="0" w:line="360" w:lineRule="auto"/>
+        <w:jc w:val="both"/>
+        <w:rPr>
+          <w:rFonts w:asciiTheme="majorBidi" w:hAnsiTheme="majorBidi" w:cstheme="majorBidi"/>
+          <w:sz w:val="28"/>
+          <w:szCs w:val="28"/>
+          <w:rtl/>
+          <w:lang w:bidi="ar-KW"/>
+        </w:rPr>
+      </w:pPr>
+      <w:r>
+        <w:rPr>
+          <w:rFonts w:asciiTheme="majorBidi" w:hAnsiTheme="majorBidi" w:cstheme="majorBidi"/>
+          <w:sz w:val="28"/>
+          <w:szCs w:val="28"/>
+          <w:rtl/>
+          <w:lang w:bidi="ar-KW"/>
+        </w:rPr>
+        <w:t xml:space="preserve">باستخدام استراتيجية استخلاص المعرفة، أطلب من الطالبات قراءة فقرة «الانخفاض في الضغط البخاري» في الكتاب المدرسي صفحة (71)، والربط بينها وبين نتائج المختبر الافتراضي، للإجابة عن السؤال: ماذا يحدث عند إذابة مادة غير متطايرة وغير إلكتروليتية (مركّب تساهمي) في مذيب سائل؟ ثم أعرض عليهن الرسم البياني التالي من خلال العرض التقديمي لنتوصّل إلى أن:</w:t>
       </w:r>
     </w:p>
     <w:p>
@@ -3260,7 +3348,7 @@
           <w:rtl/>
           <w:lang w:bidi="ar-KW"/>
         </w:rPr>
-        <w:t xml:space="preserve">ثم أعرض على الطالبات النموذج الجزيئي التالي، وأطلب منهن المقارنة بين سطح المذيب النقي وسطح المحلول، وعدد الجزيئات المتبخّرة في كلٍّ منهما:</w:t>
+        <w:t xml:space="preserve">باستخدام استراتيجية المقارنة والمناقشة، أعرض على الطالبات النموذج الجزيئي التالي، وأطلب منهن المقارنة بين سطح المذيب النقي وسطح المحلول، وعدد الجزيئات المتبخّرة في كلٍّ منهما:</w:t>
       </w:r>
     </w:p>
     <w:p>
@@ -3506,7 +3594,7 @@
           <w:rtl/>
           <w:lang w:bidi="ar-KW"/>
         </w:rPr>
-        <w:t xml:space="preserve">خامسًا: تطبيقات على الدرس (المناقشة):</w:t>
+        <w:t xml:space="preserve">سادسًا: تطبيقات على الدرس (المناقشة):</w:t>
       </w:r>
     </w:p>
     <w:p>
@@ -3529,7 +3617,7 @@
           <w:rtl/>
           <w:lang w:bidi="ar-KW"/>
         </w:rPr>
-        <w:t xml:space="preserve">أناقش مع الطالبات الأسئلة التالية للتأكد من تحقّق الأهداف:</w:t>
+        <w:t xml:space="preserve">باستخدام استراتيجية المناقشة، أناقش الطالبات في الأسئلة التالية للتأكد من تحقّق الأهداف:</w:t>
       </w:r>
     </w:p>
     <w:p>
@@ -4022,7 +4110,7 @@
           <w:rtl/>
           <w:lang w:bidi="ar-KW"/>
         </w:rPr>
-        <w:t xml:space="preserve">أكلّف الطالبات بحلّ الأسئلة التالية في المنزل:</w:t>
+        <w:t xml:space="preserve">باستخدام ورقة عمل، أكلّف الطالبات بحلّ الأسئلة التالية في المنزل:</w:t>
       </w:r>
     </w:p>
     <w:p>

</xml_diff>